<commit_message>
p1.2 lead: engine vung dieu kien {?flag}/{/flag} + converter cond blocks + tagger idempotent M72 (16 marker: 5 section loai hinh + 3 footnote sup 1/2/3) - chi xuat bien the duoc chon ra DOCX
</commit_message>
<xml_diff>
--- a/app/templates/PLI_M72.docx
+++ b/app/templates/PLI_M72.docx
@@ -30,6 +30,11 @@
           <w:b/>
         </w:rPr>
         <w:t xml:space="preserve">CÔNG BỐ NỘI DUNG ĐĂNG KÝ THÀNH LẬP DOANH NGHIỆP</w:t>
+      </w:r>
+    </w:p>
+    <w:p>
+      <w:r>
+        <w:t xml:space="preserve">{?loai_hinh_dntn}</w:t>
       </w:r>
     </w:p>
     <w:p>
@@ -726,6 +731,16 @@
       </w:r>
     </w:p>
     <w:p>
+      <w:r>
+        <w:t xml:space="preserve">{/loai_hinh_dntn}</w:t>
+      </w:r>
+    </w:p>
+    <w:p>
+      <w:r>
+        <w:t xml:space="preserve">{?loai_hinh_tnhh_1tv}</w:t>
+      </w:r>
+    </w:p>
+    <w:p>
       <w:pPr>
         <w:jc w:val="center"/>
         <w:spacing w:before="120"/>
@@ -1704,6 +1719,16 @@
       </w:r>
     </w:p>
     <w:p>
+      <w:r>
+        <w:t xml:space="preserve">{/loai_hinh_tnhh_1tv}</w:t>
+      </w:r>
+    </w:p>
+    <w:p>
+      <w:r>
+        <w:t xml:space="preserve">{?loai_hinh_tnhh_2tv}</w:t>
+      </w:r>
+    </w:p>
+    <w:p>
       <w:pPr>
         <w:jc w:val="center"/>
         <w:spacing w:before="120"/>
@@ -2754,6 +2779,16 @@
       </w:r>
     </w:p>
     <w:p>
+      <w:r>
+        <w:t xml:space="preserve">{/loai_hinh_tnhh_2tv}</w:t>
+      </w:r>
+    </w:p>
+    <w:p>
+      <w:r>
+        <w:t xml:space="preserve">{?loai_hinh_ctcp}</w:t>
+      </w:r>
+    </w:p>
+    <w:p>
       <w:pPr>
         <w:jc w:val="center"/>
         <w:spacing w:before="120"/>
@@ -3761,6 +3796,16 @@
       </w:r>
     </w:p>
     <w:p>
+      <w:r>
+        <w:t xml:space="preserve">{/loai_hinh_ctcp}</w:t>
+      </w:r>
+    </w:p>
+    <w:p>
+      <w:r>
+        <w:t xml:space="preserve">{?loai_hinh_dhdn}</w:t>
+      </w:r>
+    </w:p>
+    <w:p>
       <w:pPr>
         <w:jc w:val="center"/>
         <w:spacing w:before="120"/>
@@ -4585,6 +4630,11 @@
       </w:r>
     </w:p>
     <w:p>
+      <w:r>
+        <w:t xml:space="preserve">{/loai_hinh_dhdn}</w:t>
+      </w:r>
+    </w:p>
+    <w:p>
       <w:pPr>
         <w:spacing w:before="120"/>
       </w:pPr>
@@ -4599,6 +4649,11 @@
       </w:r>
     </w:p>
     <w:p>
+      <w:r>
+        <w:t xml:space="preserve">{?loai_hinh_tnhh_1tv}</w:t>
+      </w:r>
+    </w:p>
+    <w:p>
       <w:pPr>
         <w:spacing w:before="120"/>
       </w:pPr>
@@ -4621,6 +4676,16 @@
       </w:r>
     </w:p>
     <w:p>
+      <w:r>
+        <w:t xml:space="preserve">{/loai_hinh_tnhh_1tv}</w:t>
+      </w:r>
+    </w:p>
+    <w:p>
+      <w:r>
+        <w:t xml:space="preserve">{?loai_hinh_tnhh_2tv}</w:t>
+      </w:r>
+    </w:p>
+    <w:p>
       <w:pPr>
         <w:spacing w:before="120"/>
       </w:pPr>
@@ -4643,6 +4708,16 @@
       </w:r>
     </w:p>
     <w:p>
+      <w:r>
+        <w:t xml:space="preserve">{/loai_hinh_tnhh_2tv}</w:t>
+      </w:r>
+    </w:p>
+    <w:p>
+      <w:r>
+        <w:t xml:space="preserve">{?loai_hinh_ctcp}</w:t>
+      </w:r>
+    </w:p>
+    <w:p>
       <w:pPr>
         <w:spacing w:before="120"/>
       </w:pPr>
@@ -4671,6 +4746,11 @@
           <w:i/>
         </w:rPr>
         <w:t xml:space="preserve"/>
+      </w:r>
+    </w:p>
+    <w:p>
+      <w:r>
+        <w:t xml:space="preserve">{/loai_hinh_ctcp}</w:t>
       </w:r>
     </w:p>
     <w:p>

</xml_diff>